<commit_message>
Add 5.3.4 Detection Service Configuration and Table 5.5 endpoints; renumber command table to 5.6
Co-authored-by: arena-agent <297053741+arena-agent@users.noreply.github.com>
</commit_message>
<xml_diff>
--- a/PASTE_READY_FIXES.docx
+++ b/PASTE_READY_FIXES.docx
@@ -1673,7 +1673,7 @@
     </w:p>
     <w:p>
       <w:r>
-        <w:t>Section 5.3 has been rewritten in the departmental exemplar style: a short lead-in paragraph naming what is being configured, then four numbered, step-by-step configuration procedures (environment, detector, mail account, filtering and review). Replace your whole Section 5.3 with the block below.</w:t>
+        <w:t>Section 5.3 has been rewritten in the departmental exemplar style: a short lead-in paragraph naming what is being configured, then four numbered, step-by-step configuration procedures (environment, detector, mail account, detection service, filtering and review). It now includes a Detection Service Configuration subsection with a new Table 5.5 listing the service endpoints, which pushes the old "Command-line operations" table to Table 5.6. Replace your whole Section 5.3 with the block below, and renumber that later table to 5.6.</w:t>
       </w:r>
     </w:p>
     <w:p>
@@ -1699,7 +1699,7 @@
     </w:p>
     <w:p>
       <w:r>
-        <w:t>In this section, we outline the critical setup and configuration steps required to enable the key functionalities of the system, namely local classification, live mailbox retrieval and reviewer-driven retraining. These configurations ensure that the machine can run the detector in an isolated Python environment, that the trained model is available to every component, and that the connector is able to authenticate to a mail account over the Internet Message Access Protocol (IMAP) and act on new messages safely. No paid service, cloud classification interface or third-party scanning key is required: all classification is performed locally by the trained model, and the only credential involved is the mail-account application password used to read the mailbox. Below are the steps for configuring the Python environment, the detector itself, the mail account used for live filtering, and the filtering and review behaviour of the running system.</w:t>
+        <w:t>In this section, we outline the critical setup and configuration steps required to enable the key functionalities of the system, namely local classification, live mailbox retrieval and reviewer-driven retraining. These configurations ensure that the machine can run the detector in an isolated Python environment, that the trained model is available to every component, and that the connector is able to authenticate to a mail account over the Internet Message Access Protocol (IMAP) and act on new messages safely. No paid service, cloud classification interface or third-party scanning key is required: all classification is performed locally by the trained model, and the only credential involved is the mail-account application password used to read the mailbox. Below are the steps for configuring the Python environment, the detector itself, the mail account used for live filtering, the local detection service interface, and the filtering and review behaviour of the running system.</w:t>
       </w:r>
     </w:p>
     <w:p>
@@ -2320,7 +2320,533 @@
         <w:pStyle w:val="Heading3"/>
       </w:pPr>
       <w:r>
-        <w:t>5.3.4 Filtering and Review Configuration</w:t>
+        <w:t>5.3.4 Detection Service Configuration</w:t>
+      </w:r>
+    </w:p>
+    <w:p>
+      <w:r>
+        <w:t>The detector is exposed as a local representational-state-transfer (REST) service built with FastAPI and served by Uvicorn. The service is what the review console, the mailbox watchers and any external automation talk to, so it must be started and verified before live filtering is attempted. It listens only on the local machine and requires no account, no key and no internet connection.</w:t>
+      </w:r>
+    </w:p>
+    <w:p>
+      <w:r>
+        <w:t xml:space="preserve">1. </w:t>
+      </w:r>
+      <w:r>
+        <w:rPr>
+          <w:b/>
+        </w:rPr>
+        <w:t>Activate the environment:</w:t>
+      </w:r>
+      <w:r>
+        <w:t xml:space="preserve"> open a terminal in the project folder and run</w:t>
+      </w:r>
+    </w:p>
+    <w:p>
+      <w:r>
+        <w:t>.venv\Scripts\activate.</w:t>
+      </w:r>
+    </w:p>
+    <w:p>
+      <w:r>
+        <w:t xml:space="preserve">2. </w:t>
+      </w:r>
+      <w:r>
+        <w:rPr>
+          <w:b/>
+        </w:rPr>
+        <w:t>Confirm the model is present:</w:t>
+      </w:r>
+      <w:r>
+        <w:t xml:space="preserve"> check that models/email_spam_detector.joblib exists. The</w:t>
+      </w:r>
+    </w:p>
+    <w:p>
+      <w:r>
+        <w:t>service loads this file once at start-up; if it is missing, the service still starts but every prediction request is refused.</w:t>
+      </w:r>
+    </w:p>
+    <w:p>
+      <w:r>
+        <w:t xml:space="preserve">3. </w:t>
+      </w:r>
+      <w:r>
+        <w:rPr>
+          <w:b/>
+        </w:rPr>
+        <w:t>Start the service:</w:t>
+      </w:r>
+      <w:r>
+        <w:t xml:space="preserve"> run uvicorn spam_detection.api:app --reload. Uvicorn binds to</w:t>
+      </w:r>
+    </w:p>
+    <w:p>
+      <w:r>
+        <w:t>http://127.0.0.1:8000 by default and prints Application startup complete when ready.</w:t>
+      </w:r>
+    </w:p>
+    <w:p>
+      <w:r>
+        <w:t xml:space="preserve">4. </w:t>
+      </w:r>
+      <w:r>
+        <w:rPr>
+          <w:b/>
+        </w:rPr>
+        <w:t>Change the port if 8000 is occupied:</w:t>
+      </w:r>
+      <w:r>
+        <w:t xml:space="preserve"> restart with an explicit port, for example</w:t>
+      </w:r>
+    </w:p>
+    <w:p>
+      <w:r>
+        <w:t>uvicorn spam_detection.api:app --port 8001.</w:t>
+      </w:r>
+    </w:p>
+    <w:p>
+      <w:r>
+        <w:t xml:space="preserve">5. </w:t>
+      </w:r>
+      <w:r>
+        <w:rPr>
+          <w:b/>
+        </w:rPr>
+        <w:t>Verify that the service is healthy:</w:t>
+      </w:r>
+      <w:r>
+        <w:t xml:space="preserve"> open http://localhost:8000/health in a browser. A</w:t>
+      </w:r>
+    </w:p>
+    <w:p>
+      <w:r>
+        <w:t>response of {"status": "ready"} confirms that the model loaded successfully; a response of model_not_loaded indicates that step 2 was not satisfied.</w:t>
+      </w:r>
+    </w:p>
+    <w:p>
+      <w:r>
+        <w:t xml:space="preserve">6. </w:t>
+      </w:r>
+      <w:r>
+        <w:rPr>
+          <w:b/>
+        </w:rPr>
+        <w:t>Open the review console:</w:t>
+      </w:r>
+      <w:r>
+        <w:t xml:space="preserve"> browse to http://localhost:8000. The console is served by the</w:t>
+      </w:r>
+    </w:p>
+    <w:p>
+      <w:r>
+        <w:t>same process, so no separate front-end installation is required.</w:t>
+      </w:r>
+    </w:p>
+    <w:p>
+      <w:r>
+        <w:t xml:space="preserve">7. </w:t>
+      </w:r>
+      <w:r>
+        <w:rPr>
+          <w:b/>
+        </w:rPr>
+        <w:t>Test a single prediction:</w:t>
+      </w:r>
+      <w:r>
+        <w:t xml:space="preserve"> paste a raw email into the console and submit it, or send a</w:t>
+      </w:r>
+    </w:p>
+    <w:p>
+      <w:r>
+        <w:t>request directly to the /predict endpoint, and confirm that a label, a spam probability and the contributing metadata signals are returned.</w:t>
+      </w:r>
+    </w:p>
+    <w:p>
+      <w:r>
+        <w:t xml:space="preserve">8. </w:t>
+      </w:r>
+      <w:r>
+        <w:rPr>
+          <w:b/>
+        </w:rPr>
+        <w:t>Leave the service running:</w:t>
+      </w:r>
+      <w:r>
+        <w:t xml:space="preserve"> the mailbox watchers and the retraining control depend on it,</w:t>
+      </w:r>
+    </w:p>
+    <w:p>
+      <w:r>
+        <w:t>so the terminal window is kept open for the duration of a filtering session.</w:t>
+      </w:r>
+    </w:p>
+    <w:p>
+      <w:r>
+        <w:t>The endpoints the service exposes are listed in Table 5.5.</w:t>
+      </w:r>
+    </w:p>
+    <w:p>
+      <w:r/>
+      <w:r>
+        <w:rPr>
+          <w:b/>
+        </w:rPr>
+        <w:t>Table 5.5 — Detection-service endpoints.</w:t>
+      </w:r>
+      <w:r/>
+    </w:p>
+    <w:tbl>
+      <w:tblPr>
+        <w:tblStyle w:val="TableGrid"/>
+        <w:tblW w:type="auto" w:w="0"/>
+        <w:tblLook w:firstColumn="1" w:firstRow="1" w:lastColumn="0" w:lastRow="0" w:noHBand="0" w:noVBand="1" w:val="04A0"/>
+      </w:tblPr>
+      <w:tblGrid>
+        <w:gridCol w:w="2880"/>
+        <w:gridCol w:w="2880"/>
+        <w:gridCol w:w="2880"/>
+      </w:tblGrid>
+      <w:tr>
+        <w:tc>
+          <w:tcPr>
+            <w:tcW w:type="dxa" w:w="2880"/>
+          </w:tcPr>
+          <w:p>
+            <w:r>
+              <w:rPr>
+                <w:b/>
+              </w:rPr>
+              <w:t>Endpoint</w:t>
+            </w:r>
+          </w:p>
+        </w:tc>
+        <w:tc>
+          <w:tcPr>
+            <w:tcW w:type="dxa" w:w="2880"/>
+          </w:tcPr>
+          <w:p>
+            <w:r>
+              <w:rPr>
+                <w:b/>
+              </w:rPr>
+              <w:t>Method</w:t>
+            </w:r>
+          </w:p>
+        </w:tc>
+        <w:tc>
+          <w:tcPr>
+            <w:tcW w:type="dxa" w:w="2880"/>
+          </w:tcPr>
+          <w:p>
+            <w:r>
+              <w:rPr>
+                <w:b/>
+              </w:rPr>
+              <w:t>Purpose</w:t>
+            </w:r>
+          </w:p>
+        </w:tc>
+      </w:tr>
+      <w:tr>
+        <w:tc>
+          <w:tcPr>
+            <w:tcW w:type="dxa" w:w="2880"/>
+          </w:tcPr>
+          <w:p>
+            <w:r>
+              <w:t>`/`</w:t>
+            </w:r>
+          </w:p>
+        </w:tc>
+        <w:tc>
+          <w:tcPr>
+            <w:tcW w:type="dxa" w:w="2880"/>
+          </w:tcPr>
+          <w:p>
+            <w:r>
+              <w:t>GET</w:t>
+            </w:r>
+          </w:p>
+        </w:tc>
+        <w:tc>
+          <w:tcPr>
+            <w:tcW w:type="dxa" w:w="2880"/>
+          </w:tcPr>
+          <w:p>
+            <w:r>
+              <w:t>Serves the browser review console</w:t>
+            </w:r>
+          </w:p>
+        </w:tc>
+      </w:tr>
+      <w:tr>
+        <w:tc>
+          <w:tcPr>
+            <w:tcW w:type="dxa" w:w="2880"/>
+          </w:tcPr>
+          <w:p>
+            <w:r>
+              <w:t>`/health`</w:t>
+            </w:r>
+          </w:p>
+        </w:tc>
+        <w:tc>
+          <w:tcPr>
+            <w:tcW w:type="dxa" w:w="2880"/>
+          </w:tcPr>
+          <w:p>
+            <w:r>
+              <w:t>GET</w:t>
+            </w:r>
+          </w:p>
+        </w:tc>
+        <w:tc>
+          <w:tcPr>
+            <w:tcW w:type="dxa" w:w="2880"/>
+          </w:tcPr>
+          <w:p>
+            <w:r>
+              <w:t>Reports whether the model loaded and how many feedback rows exist</w:t>
+            </w:r>
+          </w:p>
+        </w:tc>
+      </w:tr>
+      <w:tr>
+        <w:tc>
+          <w:tcPr>
+            <w:tcW w:type="dxa" w:w="2880"/>
+          </w:tcPr>
+          <w:p>
+            <w:r>
+              <w:t>`/predict`</w:t>
+            </w:r>
+          </w:p>
+        </w:tc>
+        <w:tc>
+          <w:tcPr>
+            <w:tcW w:type="dxa" w:w="2880"/>
+          </w:tcPr>
+          <w:p>
+            <w:r>
+              <w:t>POST</w:t>
+            </w:r>
+          </w:p>
+        </w:tc>
+        <w:tc>
+          <w:tcPr>
+            <w:tcW w:type="dxa" w:w="2880"/>
+          </w:tcPr>
+          <w:p>
+            <w:r>
+              <w:t>Scores one raw email and returns the label, spam probability and metadata signals</w:t>
+            </w:r>
+          </w:p>
+        </w:tc>
+      </w:tr>
+      <w:tr>
+        <w:tc>
+          <w:tcPr>
+            <w:tcW w:type="dxa" w:w="2880"/>
+          </w:tcPr>
+          <w:p>
+            <w:r>
+              <w:t>`/feedback`</w:t>
+            </w:r>
+          </w:p>
+        </w:tc>
+        <w:tc>
+          <w:tcPr>
+            <w:tcW w:type="dxa" w:w="2880"/>
+          </w:tcPr>
+          <w:p>
+            <w:r>
+              <w:t>POST</w:t>
+            </w:r>
+          </w:p>
+        </w:tc>
+        <w:tc>
+          <w:tcPr>
+            <w:tcW w:type="dxa" w:w="2880"/>
+          </w:tcPr>
+          <w:p>
+            <w:r>
+              <w:t>Records a reviewer's correct label for a submitted email</w:t>
+            </w:r>
+          </w:p>
+        </w:tc>
+      </w:tr>
+      <w:tr>
+        <w:tc>
+          <w:tcPr>
+            <w:tcW w:type="dxa" w:w="2880"/>
+          </w:tcPr>
+          <w:p>
+            <w:r>
+              <w:t>`/queue`</w:t>
+            </w:r>
+          </w:p>
+        </w:tc>
+        <w:tc>
+          <w:tcPr>
+            <w:tcW w:type="dxa" w:w="2880"/>
+          </w:tcPr>
+          <w:p>
+            <w:r>
+              <w:t>GET</w:t>
+            </w:r>
+          </w:p>
+        </w:tc>
+        <w:tc>
+          <w:tcPr>
+            <w:tcW w:type="dxa" w:w="2880"/>
+          </w:tcPr>
+          <w:p>
+            <w:r>
+              <w:t>Returns the messages scanned by the mailbox watchers that still await review</w:t>
+            </w:r>
+          </w:p>
+        </w:tc>
+      </w:tr>
+      <w:tr>
+        <w:tc>
+          <w:tcPr>
+            <w:tcW w:type="dxa" w:w="2880"/>
+          </w:tcPr>
+          <w:p>
+            <w:r>
+              <w:t>`/queue/{row}/message`</w:t>
+            </w:r>
+          </w:p>
+        </w:tc>
+        <w:tc>
+          <w:tcPr>
+            <w:tcW w:type="dxa" w:w="2880"/>
+          </w:tcPr>
+          <w:p>
+            <w:r>
+              <w:t>GET</w:t>
+            </w:r>
+          </w:p>
+        </w:tc>
+        <w:tc>
+          <w:tcPr>
+            <w:tcW w:type="dxa" w:w="2880"/>
+          </w:tcPr>
+          <w:p>
+            <w:r>
+              <w:t>Returns the stored copy of one queued message for preview</w:t>
+            </w:r>
+          </w:p>
+        </w:tc>
+      </w:tr>
+      <w:tr>
+        <w:tc>
+          <w:tcPr>
+            <w:tcW w:type="dxa" w:w="2880"/>
+          </w:tcPr>
+          <w:p>
+            <w:r>
+              <w:t>`/queue/feedback`</w:t>
+            </w:r>
+          </w:p>
+        </w:tc>
+        <w:tc>
+          <w:tcPr>
+            <w:tcW w:type="dxa" w:w="2880"/>
+          </w:tcPr>
+          <w:p>
+            <w:r>
+              <w:t>POST</w:t>
+            </w:r>
+          </w:p>
+        </w:tc>
+        <w:tc>
+          <w:tcPr>
+            <w:tcW w:type="dxa" w:w="2880"/>
+          </w:tcPr>
+          <w:p>
+            <w:r>
+              <w:t>Records or replaces the reviewer's verdict for a queued message</w:t>
+            </w:r>
+          </w:p>
+        </w:tc>
+      </w:tr>
+      <w:tr>
+        <w:tc>
+          <w:tcPr>
+            <w:tcW w:type="dxa" w:w="2880"/>
+          </w:tcPr>
+          <w:p>
+            <w:r>
+              <w:t>`/queue/{row}/undo`</w:t>
+            </w:r>
+          </w:p>
+        </w:tc>
+        <w:tc>
+          <w:tcPr>
+            <w:tcW w:type="dxa" w:w="2880"/>
+          </w:tcPr>
+          <w:p>
+            <w:r>
+              <w:t>POST</w:t>
+            </w:r>
+          </w:p>
+        </w:tc>
+        <w:tc>
+          <w:tcPr>
+            <w:tcW w:type="dxa" w:w="2880"/>
+          </w:tcPr>
+          <w:p>
+            <w:r>
+              <w:t>Withdraws a verdict recorded in error</w:t>
+            </w:r>
+          </w:p>
+        </w:tc>
+      </w:tr>
+      <w:tr>
+        <w:tc>
+          <w:tcPr>
+            <w:tcW w:type="dxa" w:w="2880"/>
+          </w:tcPr>
+          <w:p>
+            <w:r>
+              <w:t>`/retrain`</w:t>
+            </w:r>
+          </w:p>
+        </w:tc>
+        <w:tc>
+          <w:tcPr>
+            <w:tcW w:type="dxa" w:w="2880"/>
+          </w:tcPr>
+          <w:p>
+            <w:r>
+              <w:t>POST</w:t>
+            </w:r>
+          </w:p>
+        </w:tc>
+        <w:tc>
+          <w:tcPr>
+            <w:tcW w:type="dxa" w:w="2880"/>
+          </w:tcPr>
+          <w:p>
+            <w:r>
+              <w:t>Trains a candidate model on the corpus plus accumulated corrections and deploys it only if it does not reduce ranking quality</w:t>
+            </w:r>
+          </w:p>
+        </w:tc>
+      </w:tr>
+    </w:tbl>
+    <w:p>
+      <w:r>
+        <w:t>As shown in Table 5.5, the service separates scoring from learning: the prediction endpoints are read-only with respect to the model, and the deployed model can change only through an explicit call to the retraining endpoint. This is the configuration-level expression of the human checkpoint discussed in Section 7.2.</w:t>
+      </w:r>
+    </w:p>
+    <w:p>
+      <w:pPr>
+        <w:pStyle w:val="Heading3"/>
+      </w:pPr>
+      <w:r>
+        <w:t>5.3.5 Filtering and Review Configuration</w:t>
       </w:r>
     </w:p>
     <w:p>
@@ -2388,25 +2914,6 @@
         <w:rPr>
           <w:b/>
         </w:rPr>
-        <w:t>Start the review service:</w:t>
-      </w:r>
-      <w:r>
-        <w:t xml:space="preserve"> run uvicorn spam_detection.api:app --reload from the project</w:t>
-      </w:r>
-    </w:p>
-    <w:p>
-      <w:r>
-        <w:t>folder and open the console in a browser at http://localhost:8000.</w:t>
-      </w:r>
-    </w:p>
-    <w:p>
-      <w:r>
-        <w:t xml:space="preserve">5. </w:t>
-      </w:r>
-      <w:r>
-        <w:rPr>
-          <w:b/>
-        </w:rPr>
         <w:t>Review and correct verdicts:</w:t>
       </w:r>
       <w:r>
@@ -2420,7 +2927,7 @@
     </w:p>
     <w:p>
       <w:r>
-        <w:t xml:space="preserve">6. </w:t>
+        <w:t xml:space="preserve">5. </w:t>
       </w:r>
       <w:r>
         <w:rPr>
@@ -2429,12 +2936,12 @@
         <w:t>Trigger retraining when required:</w:t>
       </w:r>
       <w:r>
-        <w:t xml:space="preserve"> use the retraining control in the console. The candidate</w:t>
+        <w:t xml:space="preserve"> use the retraining control in the console, which calls</w:t>
       </w:r>
     </w:p>
     <w:p>
       <w:r>
-        <w:t>model replaces the deployed model only if it does not reduce ranking quality on the held-out split.</w:t>
+        <w:t>the /retrain endpoint listed in Table 5.5. The candidate model replaces the deployed model only if it does not reduce ranking quality on the held-out split.</w:t>
       </w:r>
     </w:p>
     <w:p>

</xml_diff>

<commit_message>
Chapter 7: two subsections only; move limitations into 6.3 Project Challenges
Co-authored-by: arena-agent <297053741+arena-agent@users.noreply.github.com>
</commit_message>
<xml_diff>
--- a/PASTE_READY_FIXES.docx
+++ b/PASTE_READY_FIXES.docx
@@ -1627,7 +1627,32 @@
         <w:pStyle w:val="Heading3"/>
       </w:pPr>
       <w:r>
-        <w:t>5e. Add Section 7.2 (missing entirely), between 7.1 and the Recommendation section</w:t>
+        <w:t>5e. Chapter 7 must have only TWO subsections</w:t>
+      </w:r>
+    </w:p>
+    <w:p>
+      <w:r>
+        <w:t>Your guideline specifies exactly:</w:t>
+      </w:r>
+    </w:p>
+    <w:p>
+      <w:r>
+        <w:t>7.1 Conclusion</w:t>
+      </w:r>
+    </w:p>
+    <w:p>
+      <w:r>
+        <w:t>7.2 Recommendation</w:t>
+      </w:r>
+    </w:p>
+    <w:p>
+      <w:r>
+        <w:t>So do NOT add a separate Limitations section. The limitations material has been moved into Section 6.3 Project Challenges instead, which is where it belongs. Replace your whole Section 6.3 with the block below, and make sure Chapter 7 contains only 7.1 and 7.2.</w:t>
+      </w:r>
+    </w:p>
+    <w:p>
+      <w:r>
+        <w:t>Chapter 7 is now about 1.4 pages, inside the 2-to-5-page guideline once the headings and spacing are applied in Word.</w:t>
       </w:r>
     </w:p>
     <w:p>
@@ -1635,27 +1660,264 @@
         <w:pStyle w:val="Heading2"/>
       </w:pPr>
       <w:r>
-        <w:t>7.2 Limitations of the Adaptation Mechanism</w:t>
+        <w:t>6.3 Project Challenges</w:t>
       </w:r>
     </w:p>
     <w:p>
       <w:r>
-        <w:t>Two properties of the adaptation loop constrain how quickly and how safely the deployed model can change, and both were deliberate design decisions rather than oversights.</w:t>
+        <w:t xml:space="preserve">Three challenges dominated the evaluation. First, </w:t>
+      </w:r>
+      <w:r>
+        <w:rPr>
+          <w:b/>
+        </w:rPr>
+        <w:t>false positives</w:t>
+      </w:r>
+      <w:r>
+        <w:t xml:space="preserve"> were the dominant practical concern and motivated both the metadata standardisation work and the configurable threshold; the held-out false-positive rate of approximately 0.9% reflected this emphasis. Second, </w:t>
+      </w:r>
+      <w:r>
+        <w:rPr>
+          <w:b/>
+        </w:rPr>
+        <w:t>threats to validity</w:t>
+      </w:r>
+      <w:r>
+        <w:t xml:space="preserve"> were stated explicitly: the 99.2% figure came from a held-out split of a combined public corpus in which the class sources were stylistically distinct, so real-organisation performance would require separate validation; body-only external emails could not exercise header metadata; and the synthetic adaptation experiment demonstrated the mechanism on controlled data. Third, </w:t>
+      </w:r>
+      <w:r>
+        <w:rPr>
+          <w:b/>
+        </w:rPr>
+        <w:t>AI authorship was deliberately not predicted</w:t>
+      </w:r>
+      <w:r>
+        <w:t>; the system detected malicious intent, and AI-generated emails were used strictly as a held-out test of generalisation. No claim of superiority over a commercial filter was made.</w:t>
       </w:r>
     </w:p>
     <w:p>
       <w:r>
-        <w:t>The first is that retraining is a batch operation and cannot be performed on a single new message. Term weighting in the proposed system is corpus-dependent: as Equation (3.2) shows, the inverse document frequency of a term is computed from the total number of documents and the number of documents containing that term, so introducing one additional message changes the weight of every term in the vocabulary. The vectoriser and the classifier must therefore be refitted together over the whole corpus, which takes several minutes on the 81,152-message dataset. Training on the corrected message alone is not a valid alternative: the resulting model would represent only that single example and would discard everything learned from the remaining corpus, an effect known as catastrophic forgetting. Retraining is consequently performed as a scheduled maintenance action on the corpus together with the accumulated corrections, rather than after every individual review.</w:t>
+        <w:t>Two properties of the adaptation loop also constrained how quickly and how safely the deployed model could change, and both were deliberate design decisions rather than oversights.</w:t>
       </w:r>
     </w:p>
     <w:p>
       <w:r>
-        <w:t>An incremental alternative exists. A stochastic-gradient classifier combined with feature hashing supports partial fitting, and would allow the model to be updated in milliseconds for each reviewed message. It was not adopted here for two reasons. Such a model forgoes the calibrated probability estimates that the present system relies on for its adjustable decision threshold and for the explanation of individual verdicts, and, more importantly, it removes the human checkpoint between a reviewer's correction and a change in the deployed model. That checkpoint is a security control. Adaptive filters are a documented target for label-flipping poisoning attacks, in which an adversary submits deliberately mislabelled messages so that the decision boundary shifts in their favour over time. In the proposed system a correction cannot alter the deployed model until a reviewer explicitly requests retraining, and the candidate model is then accepted only if it does not reduce ranking quality on the held-out split; a batch of corrupted corrections is therefore rejected automatically rather than silently degrading detection.</w:t>
+        <w:t>Two properties of the adaptation loop constrain how quickly and how safely the deployed model can change, and both were deliberate design decisions rather than oversights.</w:t>
       </w:r>
     </w:p>
     <w:p>
       <w:r>
+        <w:t>The first is that retraining is a batch operation and cannot be performed on a single new message. Term weighting in the proposed system is corpus-dependent: as Equation (3.2) shows, the inverse document frequency of a term is computed from the total number of documents and the number of documents containing that term, so introducing one additional message changes the weight of every term in the vocabulary. The vectoriser and the classifier must therefore be refitted together over the whole corpus, which takes several minutes on the 81,152-message dataset. Training on the corrected message alone is not a valid alternative: the resulting model would represent only that single example and would discard everything learned from the remaining corpus, an effect known as catastrophic forgetting. Retraining is consequently performed as a scheduled maintenance action on the corpus together with the accumulated corrections, rather than after every individual review.</w:t>
+      </w:r>
+    </w:p>
+    <w:p>
+      <w:r>
+        <w:t>An incremental alternative exists. A stochastic-gradient classifier combined with feature hashing supports partial fitting, and would allow the model to be updated in milliseconds for each reviewed message. It was not adopted here for two reasons. Such a model forgoes the calibrated probability estimates that the present system relies on for its adjustable decision threshold and for the explanation of individual verdicts, and, more importantly, it removes the human checkpoint between a reviewer's correction and a change in the deployed model. That checkpoint is a security control. Adaptive filters are a documented target for label-flipping poisoning attacks, in which an adversary submits deliberately mislabelled messages so that the decision boundary shifts in their favour over time. In the proposed system a correction cannot alter the deployed model until a reviewer explicitly requests retraining, and the candidate model is then accepted only if it does not reduce ranking quality on the held-out split; a batch of corrupted corrections is therefore rejected automatically rather than silently degrading detection.</w:t>
+      </w:r>
+    </w:p>
+    <w:p>
+      <w:r>
         <w:t>The second limitation is that the validation gate protects against a poor batch of corrections but does not provide model versioning. Once a candidate model has been accepted and deployed, there is no automated mechanism to revert to a previous version, and a reviewer correction recorded in error can be changed or withdrawn only before the next retraining cycle is run.</w:t>
+      </w:r>
+    </w:p>
+    <w:p>
+      <w:r>
+        <w:t>Because the model returned a probability rather than only a label, the same artefact supported two operating points without retraining: a higher threshold protected legitimate traffic for a conservative deployment, while a lower threshold favoured recall when missing a phishing message was judged costlier. The consistently lower confidence observed on AI-generated mail also gave a practical, measurable signal: messages scoring in the uncertain band were precisely those that should be routed to the human review queue, closing the loop between classification and the adaptation mechanism.</w:t>
+      </w:r>
+    </w:p>
+    <w:p>
+      <w:pPr>
+        <w:pStyle w:val="Heading3"/>
+      </w:pPr>
+      <w:r>
+        <w:t>5f. Chapter 7 in full (7.1 and 7.2 only)</w:t>
+      </w:r>
+    </w:p>
+    <w:p>
+      <w:pPr>
+        <w:pStyle w:val="Heading1"/>
+      </w:pPr>
+      <w:r>
+        <w:t>CHAPTER 7: CONCLUSION AND RECOMMENDATION</w:t>
+      </w:r>
+    </w:p>
+    <w:p>
+      <w:r>
+        <w:t>This final chapter concludes the project. It first summarises what was achieved and how the results satisfied each of the four objectives stated in Chapter 1, then reflects on the limitations of the present system and recommends directions for future work, including a direct comparison with commercial filters on the same emails and deployment in a live mail environment.</w:t>
+      </w:r>
+    </w:p>
+    <w:p>
+      <w:pPr>
+        <w:pStyle w:val="Heading2"/>
+      </w:pPr>
+      <w:r>
+        <w:t>7.1 Conclusion</w:t>
+      </w:r>
+    </w:p>
+    <w:p>
+      <w:r>
+        <w:t>An adaptive email spam detection system using artificial intelligence and content–metadata fusion was designed, implemented and evaluated. The system fused word and character TF-IDF content features with thirteen standardised structural metadata signals in a class-balanced logistic-regression model, with Naïve Bayes and a linear support vector machine evaluated for comparison. On a held-out split of 81,152 public emails it achieved 99.2% accuracy with precision 0.991, recall 0.992 and ROC-AUC of 1.000, at a median latency of approximately 13 milliseconds per email on a commodity central processing unit and a false-positive rate of about</w:t>
+      </w:r>
+    </w:p>
+    <w:p>
+      <w:r>
+        <w:t>0.9%. It flagged 92% of previously unseen phishing emails generated by three large language</w:t>
+      </w:r>
+    </w:p>
+    <w:p>
+      <w:r>
+        <w:t>models, demonstrating that a conventionally trained fusion detector generalises strongly to AI-assisted phishing without any AI-specific training. After a single reviewed retraining cycle it improved from ROC-AUC 0.81 to 0.945 on held-out modern-threat email while preserving main-corpus accuracy, evidencing an effective and practical adaptation mechanism. The system was delivered as a local, open-source service with a browser review console, mailbox quarantine and feedback-driven retraining, satisfying all four stated objectives.</w:t>
+      </w:r>
+    </w:p>
+    <w:p>
+      <w:pPr>
+        <w:pStyle w:val="Heading2"/>
+      </w:pPr>
+      <w:r>
+        <w:t>7.2 Recommendation</w:t>
+      </w:r>
+    </w:p>
+    <w:p>
+      <w:r>
+        <w:t>Several directions were identified for future work:</w:t>
+      </w:r>
+    </w:p>
+    <w:p>
+      <w:r>
+        <w:t xml:space="preserve">1. </w:t>
+      </w:r>
+      <w:r>
+        <w:rPr>
+          <w:b/>
+        </w:rPr>
+        <w:t>Hardened, production-grade mail-server deployment.</w:t>
+      </w:r>
+      <w:r>
+        <w:t xml:space="preserve"> A connector for a live mailbox over</w:t>
+      </w:r>
+    </w:p>
+    <w:p>
+      <w:r>
+        <w:t>the Internet Message Access Protocol (IMAP) — the standard protocol email clients use to read a mailbox — was implemented, allowing the system to fetch new messages automatically, move spam to a quarantine folder and log decisions for review (Section 5.4). The remaining work is to harden this connector for continuous production use: integration directly with a mail-transfer agent or a provider application programming interface, encrypted storage of the account credentials, automatic reconnection and error recovery, and server-level quarantine/restore controls, so the filter can run unattended on an organisational mail server under formal authorisation.</w:t>
+      </w:r>
+    </w:p>
+    <w:p>
+      <w:r>
+        <w:t xml:space="preserve">2. </w:t>
+      </w:r>
+      <w:r>
+        <w:rPr>
+          <w:b/>
+        </w:rPr>
+        <w:t>Controlled black-box comparison with live filters.</w:t>
+      </w:r>
+      <w:r>
+        <w:t xml:space="preserve"> As directed during supervision, run a</w:t>
+      </w:r>
+    </w:p>
+    <w:p>
+      <w:r>
+        <w:t>controlled black-box test in which one fixed, labelled set of emails is submitted simultaneously to the proposed detector and to live commercial filters (such as Gmail and Microsoft 365) through disposable accounts under appropriate authorisation; all systems are then scored on the identical messages with the same metrics, removing the dataset mismatch that limits literature-based comparisons.</w:t>
+      </w:r>
+    </w:p>
+    <w:p>
+      <w:r>
+        <w:t xml:space="preserve">3. </w:t>
+      </w:r>
+      <w:r>
+        <w:rPr>
+          <w:b/>
+        </w:rPr>
+        <w:t>Operational retraining.</w:t>
+      </w:r>
+      <w:r>
+        <w:t xml:space="preserve"> Operationalise periodic scheduled retraining with drift</w:t>
+      </w:r>
+    </w:p>
+    <w:p>
+      <w:r>
+        <w:t>monitoring, retraining on reviewed genuine new-campaign samples rather than synthetic data.</w:t>
+      </w:r>
+    </w:p>
+    <w:p>
+      <w:r>
+        <w:t xml:space="preserve">4. </w:t>
+      </w:r>
+      <w:r>
+        <w:rPr>
+          <w:b/>
+        </w:rPr>
+        <w:t>Feature refinement.</w:t>
+      </w:r>
+      <w:r>
+        <w:t xml:space="preserve"> Extend the metadata signal set (for example header-routing anomalies</w:t>
+      </w:r>
+    </w:p>
+    <w:p>
+      <w:r>
+        <w:t>and attachment-type analysis) and run a larger ablation over feature groups to quantify each signal's contribution.</w:t>
+      </w:r>
+    </w:p>
+    <w:p>
+      <w:r>
+        <w:t xml:space="preserve">5. </w:t>
+      </w:r>
+      <w:r>
+        <w:rPr>
+          <w:b/>
+        </w:rPr>
+        <w:t>Broader evaluation.</w:t>
+      </w:r>
+      <w:r>
+        <w:t xml:space="preserve"> Evaluate on additional organisational and multilingual mail after</w:t>
+      </w:r>
+    </w:p>
+    <w:p>
+      <w:r>
+        <w:t>obtaining the necessary approvals, to test generalisation beyond the public-corpus setting.</w:t>
+      </w:r>
+    </w:p>
+    <w:p>
+      <w:r>
+        <w:t xml:space="preserve">6. </w:t>
+      </w:r>
+      <w:r>
+        <w:rPr>
+          <w:b/>
+        </w:rPr>
+        <w:t>Model versioning and rollback.</w:t>
+      </w:r>
+      <w:r>
+        <w:t xml:space="preserve"> Retain previous model versions with their evaluation</w:t>
+      </w:r>
+    </w:p>
+    <w:p>
+      <w:r>
+        <w:t>records so that a deployed model can be reverted if a retraining cycle is later found to have degraded performance, complementing the validation gate described in Section 6.3 with after-the-fact recovery.</w:t>
+      </w:r>
+    </w:p>
+    <w:p>
+      <w:r>
+        <w:t xml:space="preserve">7. </w:t>
+      </w:r>
+      <w:r>
+        <w:rPr>
+          <w:b/>
+        </w:rPr>
+        <w:t>Resistance to adversarial manipulation.</w:t>
+      </w:r>
+      <w:r>
+        <w:t xml:space="preserve"> Evaluate the detector against deliberate evasion</w:t>
+      </w:r>
+    </w:p>
+    <w:p>
+      <w:r>
+        <w:t>as well as poisoning: good-word insertion, in which a phishing message is padded with legitimate vocabulary to dilute its score, and character-level obfuscation using visually identical characters from other alphabets. The character n-gram component is expected to provide partial resistance to the latter, and quantifying that resistance would strengthen the security case for content–metadata fusion.</w:t>
+      </w:r>
+    </w:p>
+    <w:p>
+      <w:r>
+        <w:br w:type="page"/>
       </w:r>
     </w:p>
     <w:p>
@@ -2941,7 +3203,7 @@
     </w:p>
     <w:p>
       <w:r>
-        <w:t>the /retrain endpoint listed in Table 5.5. The candidate model replaces the deployed model only if it does not reduce ranking quality on the held-out split.</w:t>
+        <w:t>the /retrain endpoint listed in Table 5.5. Retraining is a planned batch operation initiated by the reviewer; no automatic timer is used, so no change reaches the deployed model without human authorisation. The candidate model replaces the deployed model only if it does not reduce ranking quality on the held-out split.</w:t>
       </w:r>
     </w:p>
     <w:p>

</xml_diff>